<commit_message>
Oficio de devolución: filas de la tabla con alto automático y DISTRIBUCIÓN sin cortes
- La fila de datos heredaba un alto mínimo de ~2 cm del formato; ahora crece según su texto
- El bloque DISTRIBUCIÓN no se divide entre páginas

Co-Authored-By: Claude Opus 5.5 <noreply@anthropic.com>
</commit_message>
<xml_diff>
--- a/templates/devolucion_template.docx
+++ b/templates/devolucion_template.docx
@@ -1534,7 +1534,7 @@
       </w:tr>
       <w:tr>
         <w:trPr>
-          <w:trHeight w:val="1216"/>
+          <w:trHeight w:val="400"/>
         </w:trPr>
         <w:tc>
           <w:tcPr>
@@ -2504,6 +2504,7 @@
     <w:p>
       <w:pPr>
         <w:pStyle w:val="Default"/>
+        <w:keepNext/>
         <w:rPr>
           <w:sz w:val="18"/>
           <w:szCs w:val="18"/>
@@ -2524,6 +2525,7 @@
     <w:p>
       <w:pPr>
         <w:pStyle w:val="Default"/>
+        <w:keepNext/>
         <w:rPr>
           <w:sz w:val="18"/>
           <w:szCs w:val="18"/>
@@ -2560,6 +2562,7 @@
     <w:p>
       <w:pPr>
         <w:pStyle w:val="Default"/>
+        <w:keepNext/>
         <w:rPr>
           <w:b/>
           <w:bCs/>
@@ -2598,6 +2601,7 @@
     <w:p>
       <w:pPr>
         <w:pStyle w:val="Default"/>
+        <w:keepNext/>
         <w:rPr>
           <w:sz w:val="18"/>
           <w:szCs w:val="18"/>

</xml_diff>

<commit_message>
Ajustes de memos, devoluciones, resumen e historiales según revisión
- Memo: segunda línea de ASUNTO alineada con "Solicita"
- Datos a completar con marcadores descriptivos ([N° factura], [banco]...) y
  fondo amarillo en el Word; MOTIVO/OBSERVACIONES solo en el Word
- TIPO DE IPE tomado de la planilla (no editable; "vacío" si no viene);
  "Error en pago 1/2/3" elige la redacción
- Sin aplicaciones previas ni "saldo Excel" en pantalla (van en el Word);
  columna "Categoría", fechas completas, simbología y buscador por RUT/empresa
- Devoluciones: selector de bancos de Chile (con opción "Otro")
- Resumen: sin cuadro de banderas; listado numerado de empresas pendientes con
  MI GESTION; filtro "Todas las categorías"
- Historiales: sin N° de memo/oficio; RUT completo

Co-Authored-By: Claude Opus 5.5 <noreply@anthropic.com>
</commit_message>
<xml_diff>
--- a/templates/devolucion_template.docx
+++ b/templates/devolucion_template.docx
@@ -321,7 +321,41 @@
                       <w:szCs w:val="22"/>
                       <w:lang w:val="es-CL"/>
                     </w:rPr>
-                    <w:t xml:space="preserve">{referencia}</w:t>
+                    <w:t xml:space="preserve">{#referencia}</w:t>
+                  </w:r>
+                  <w:r>
+                    <w:rPr>
+                      <w:rFonts w:ascii="Arial" w:hAnsi="Arial" w:cs="Arial"/>
+                      <w:iCs/>
+                      <w:color w:val="000000"/>
+                      <w:sz w:val="22"/>
+                      <w:szCs w:val="22"/>
+                      <w:lang w:val="es-CL"/>
+                    </w:rPr>
+                    <w:t xml:space="preserve">{#n}{t}{/n}</w:t>
+                  </w:r>
+                  <w:r>
+                    <w:rPr>
+                      <w:rFonts w:ascii="Arial" w:hAnsi="Arial" w:cs="Arial"/>
+                      <w:iCs/>
+                      <w:color w:val="000000"/>
+                      <w:sz w:val="22"/>
+                      <w:szCs w:val="22"/>
+                      <w:highlight w:val="yellow"/>
+                      <w:lang w:val="es-CL"/>
+                    </w:rPr>
+                    <w:t xml:space="preserve">{#m}{t}{/m}</w:t>
+                  </w:r>
+                  <w:r>
+                    <w:rPr>
+                      <w:rFonts w:ascii="Arial" w:hAnsi="Arial" w:cs="Arial"/>
+                      <w:iCs/>
+                      <w:color w:val="000000"/>
+                      <w:sz w:val="22"/>
+                      <w:szCs w:val="22"/>
+                      <w:lang w:val="es-CL"/>
+                    </w:rPr>
+                    <w:t xml:space="preserve">{/referencia}</w:t>
                   </w:r>
                 </w:p>
                 <w:p>
@@ -1720,7 +1754,35 @@
                 <w:szCs w:val="22"/>
                 <w:lang w:val="es-CL" w:eastAsia="es-CL"/>
               </w:rPr>
-              <w:t xml:space="preserve">{observaciones}{/items}</w:t>
+              <w:t xml:space="preserve">{#observaciones}</w:t>
+            </w:r>
+            <w:r>
+              <w:rPr>
+                <w:rFonts w:ascii="Arial" w:hAnsi="Arial" w:cs="Arial"/>
+                <w:sz w:val="22"/>
+                <w:szCs w:val="22"/>
+                <w:lang w:val="es-CL" w:eastAsia="es-CL"/>
+              </w:rPr>
+              <w:t xml:space="preserve">{#n}{t}{/n}</w:t>
+            </w:r>
+            <w:r>
+              <w:rPr>
+                <w:rFonts w:ascii="Arial" w:hAnsi="Arial" w:cs="Arial"/>
+                <w:sz w:val="22"/>
+                <w:szCs w:val="22"/>
+                <w:highlight w:val="yellow"/>
+                <w:lang w:val="es-CL" w:eastAsia="es-CL"/>
+              </w:rPr>
+              <w:t xml:space="preserve">{#m}{t}{/m}</w:t>
+            </w:r>
+            <w:r>
+              <w:rPr>
+                <w:rFonts w:ascii="Arial" w:hAnsi="Arial" w:cs="Arial"/>
+                <w:sz w:val="22"/>
+                <w:szCs w:val="22"/>
+                <w:lang w:val="es-CL" w:eastAsia="es-CL"/>
+              </w:rPr>
+              <w:t xml:space="preserve">{/observaciones}{/items}</w:t>
             </w:r>
           </w:p>
           <w:p>
@@ -1930,7 +1992,32 @@
           <w:szCs w:val="22"/>
         </w:rPr>
         <w:tab/>
-        <w:t xml:space="preserve">{tipo_cuenta}</w:t>
+        <w:t xml:space="preserve">{#tipo_cuenta}</w:t>
+      </w:r>
+      <w:r>
+        <w:rPr>
+          <w:rFonts w:ascii="Arial" w:hAnsi="Arial" w:cs="Arial"/>
+          <w:sz w:val="22"/>
+          <w:szCs w:val="22"/>
+        </w:rPr>
+        <w:t xml:space="preserve">{#n}{t}{/n}</w:t>
+      </w:r>
+      <w:r>
+        <w:rPr>
+          <w:rFonts w:ascii="Arial" w:hAnsi="Arial" w:cs="Arial"/>
+          <w:sz w:val="22"/>
+          <w:szCs w:val="22"/>
+          <w:highlight w:val="yellow"/>
+        </w:rPr>
+        <w:t xml:space="preserve">{#m}{t}{/m}</w:t>
+      </w:r>
+      <w:r>
+        <w:rPr>
+          <w:rFonts w:ascii="Arial" w:hAnsi="Arial" w:cs="Arial"/>
+          <w:sz w:val="22"/>
+          <w:szCs w:val="22"/>
+        </w:rPr>
+        <w:t xml:space="preserve">{/tipo_cuenta}</w:t>
       </w:r>
     </w:p>
     <w:p>
@@ -1977,7 +2064,35 @@
           <w:sz w:val="22"/>
           <w:szCs w:val="22"/>
         </w:rPr>
-        <w:t xml:space="preserve">{numero_cuenta}</w:t>
+        <w:t xml:space="preserve">{#numero_cuenta}</w:t>
+      </w:r>
+      <w:r>
+        <w:rPr>
+          <w:rFonts w:ascii="Arial" w:hAnsi="Arial" w:cs="Arial"/>
+          <w:color w:val="222222"/>
+          <w:sz w:val="22"/>
+          <w:szCs w:val="22"/>
+        </w:rPr>
+        <w:t xml:space="preserve">{#n}{t}{/n}</w:t>
+      </w:r>
+      <w:r>
+        <w:rPr>
+          <w:rFonts w:ascii="Arial" w:hAnsi="Arial" w:cs="Arial"/>
+          <w:color w:val="222222"/>
+          <w:sz w:val="22"/>
+          <w:szCs w:val="22"/>
+          <w:highlight w:val="yellow"/>
+        </w:rPr>
+        <w:t xml:space="preserve">{#m}{t}{/m}</w:t>
+      </w:r>
+      <w:r>
+        <w:rPr>
+          <w:rFonts w:ascii="Arial" w:hAnsi="Arial" w:cs="Arial"/>
+          <w:color w:val="222222"/>
+          <w:sz w:val="22"/>
+          <w:szCs w:val="22"/>
+        </w:rPr>
+        <w:t xml:space="preserve">{/numero_cuenta}</w:t>
       </w:r>
     </w:p>
     <w:p>
@@ -2024,7 +2139,35 @@
           <w:sz w:val="22"/>
           <w:szCs w:val="22"/>
         </w:rPr>
-        <w:t xml:space="preserve">{banco}</w:t>
+        <w:t xml:space="preserve">{#banco}</w:t>
+      </w:r>
+      <w:r>
+        <w:rPr>
+          <w:rFonts w:ascii="Arial" w:hAnsi="Arial" w:cs="Arial"/>
+          <w:color w:val="000000"/>
+          <w:sz w:val="22"/>
+          <w:szCs w:val="22"/>
+        </w:rPr>
+        <w:t xml:space="preserve">{#n}{t}{/n}</w:t>
+      </w:r>
+      <w:r>
+        <w:rPr>
+          <w:rFonts w:ascii="Arial" w:hAnsi="Arial" w:cs="Arial"/>
+          <w:color w:val="000000"/>
+          <w:sz w:val="22"/>
+          <w:szCs w:val="22"/>
+          <w:highlight w:val="yellow"/>
+        </w:rPr>
+        <w:t xml:space="preserve">{#m}{t}{/m}</w:t>
+      </w:r>
+      <w:r>
+        <w:rPr>
+          <w:rFonts w:ascii="Arial" w:hAnsi="Arial" w:cs="Arial"/>
+          <w:color w:val="000000"/>
+          <w:sz w:val="22"/>
+          <w:szCs w:val="22"/>
+        </w:rPr>
+        <w:t xml:space="preserve">{/banco}</w:t>
       </w:r>
     </w:p>
     <w:p>

</xml_diff>